<commit_message>
Nộp PHT chương 5
</commit_message>
<xml_diff>
--- a/Bài Tập/CSE485-CNW-Chuong5-PHT.docx
+++ b/Bài Tập/CSE485-CNW-Chuong5-PHT.docx
@@ -4565,7 +4565,7 @@
           </mc:Choice>
           <mc:Fallback>
             <w:pict>
-              <v:group w14:anchorId="2B0CB65F" id="Group 7" o:spid="_x0000_s1026" style="position:absolute;margin-left:79.2pt;margin-top:147.3pt;width:453pt;height:1.6pt;z-index:-15727616;mso-wrap-distance-left:0;mso-wrap-distance-right:0;mso-position-horizontal-relative:page" coordsize="57531,203" o:gfxdata="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">
+              <v:group w14:anchorId="37AFAA3E" id="Group 7" o:spid="_x0000_s1026" style="position:absolute;margin-left:79.2pt;margin-top:147.3pt;width:453pt;height:1.6pt;z-index:-15727616;mso-wrap-distance-left:0;mso-wrap-distance-right:0;mso-position-horizontal-relative:page" coordsize="57531,203" o:gfxdata="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">
                 <v:shape id="Graphic 8" o:spid="_x0000_s1027" style="position:absolute;width:57530;height:203;visibility:visible;mso-wrap-style:square;v-text-anchor:top" coordsize="5753100,20320" o:gfxdata="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" path="m5753100,r-3036,l,,,1524,,3048,,19799r5753100,l5753100,3048r,-1524l5753100,xe" fillcolor="#a0a0a0" stroked="f">
                   <v:path arrowok="t"/>
                 </v:shape>
@@ -16159,7 +16159,7 @@
           </mc:Choice>
           <mc:Fallback>
             <w:pict>
-              <v:shape w14:anchorId="18908E18" id="Graphic 20" o:spid="_x0000_s1026" style="position:absolute;margin-left:77.75pt;margin-top:26.65pt;width:455.8pt;height:732.5pt;z-index:-15867904;visibility:visible;mso-wrap-style:square;mso-wrap-distance-left:0;mso-wrap-distance-top:0;mso-wrap-distance-right:0;mso-wrap-distance-bottom:0;mso-position-horizontal:absolute;mso-position-horizontal-relative:page;mso-position-vertical:absolute;mso-position-vertical-relative:page;v-text-anchor:top" coordsize="5788660,9302750" o:gfxdata="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" path="m5788139,l,,,272808,,547116,,9302496r5788139,l5788139,272808,5788139,xe" fillcolor="#f2f2f2" stroked="f">
+              <v:shape w14:anchorId="3C86E41B" id="Graphic 20" o:spid="_x0000_s1026" style="position:absolute;margin-left:77.75pt;margin-top:26.65pt;width:455.8pt;height:732.5pt;z-index:-15867904;visibility:visible;mso-wrap-style:square;mso-wrap-distance-left:0;mso-wrap-distance-top:0;mso-wrap-distance-right:0;mso-wrap-distance-bottom:0;mso-position-horizontal:absolute;mso-position-horizontal-relative:page;mso-position-vertical:absolute;mso-position-vertical-relative:page;v-text-anchor:top" coordsize="5788660,9302750" o:gfxdata="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" path="m5788139,l,,,272808,,547116,,9302496r5788139,l5788139,272808,5788139,xe" fillcolor="#f2f2f2" stroked="f">
                 <v:path arrowok="t"/>
                 <w10:wrap anchorx="page" anchory="page"/>
               </v:shape>
@@ -19091,6 +19091,266 @@
     </w:p>
     <w:p>
       <w:pPr>
+        <w:tabs>
+          <w:tab w:val="left" w:pos="820"/>
+        </w:tabs>
+        <w:spacing w:before="205"/>
+        <w:rPr>
+          <w:lang w:val="vi-VN"/>
+        </w:rPr>
+      </w:pPr>
+      <w:r>
+        <w:rPr>
+          <w:lang w:val="vi-VN"/>
+        </w:rPr>
+        <w:t>&lt;?php</w:t>
+      </w:r>
+    </w:p>
+    <w:p>
+      <w:pPr>
+        <w:tabs>
+          <w:tab w:val="left" w:pos="820"/>
+        </w:tabs>
+        <w:spacing w:before="205"/>
+        <w:rPr>
+          <w:lang w:val="vi-VN"/>
+        </w:rPr>
+      </w:pPr>
+    </w:p>
+    <w:p>
+      <w:pPr>
+        <w:tabs>
+          <w:tab w:val="left" w:pos="820"/>
+        </w:tabs>
+        <w:spacing w:before="205"/>
+        <w:rPr>
+          <w:lang w:val="vi-VN"/>
+        </w:rPr>
+      </w:pPr>
+      <w:r>
+        <w:rPr>
+          <w:lang w:val="vi-VN"/>
+        </w:rPr>
+        <w:t>function getAllSinhVien($pdo) {</w:t>
+      </w:r>
+    </w:p>
+    <w:p>
+      <w:pPr>
+        <w:tabs>
+          <w:tab w:val="left" w:pos="820"/>
+        </w:tabs>
+        <w:spacing w:before="205"/>
+        <w:rPr>
+          <w:lang w:val="vi-VN"/>
+        </w:rPr>
+      </w:pPr>
+      <w:r>
+        <w:rPr>
+          <w:lang w:val="vi-VN"/>
+        </w:rPr>
+        <w:t xml:space="preserve">    // Sửa lại tên cột ngay_tao giống database Chương 4 của bạn</w:t>
+      </w:r>
+    </w:p>
+    <w:p>
+      <w:pPr>
+        <w:tabs>
+          <w:tab w:val="left" w:pos="820"/>
+        </w:tabs>
+        <w:spacing w:before="205"/>
+        <w:rPr>
+          <w:lang w:val="vi-VN"/>
+        </w:rPr>
+      </w:pPr>
+      <w:r>
+        <w:rPr>
+          <w:lang w:val="vi-VN"/>
+        </w:rPr>
+        <w:t xml:space="preserve">    $sql = "SELECT * FROM sinhvien ORDER BY ngay_tao DESC";</w:t>
+      </w:r>
+    </w:p>
+    <w:p>
+      <w:pPr>
+        <w:tabs>
+          <w:tab w:val="left" w:pos="820"/>
+        </w:tabs>
+        <w:spacing w:before="205"/>
+        <w:rPr>
+          <w:lang w:val="vi-VN"/>
+        </w:rPr>
+      </w:pPr>
+      <w:r>
+        <w:rPr>
+          <w:lang w:val="vi-VN"/>
+        </w:rPr>
+        <w:t xml:space="preserve">    $stmt = $pdo-&gt;query($sql);</w:t>
+      </w:r>
+    </w:p>
+    <w:p>
+      <w:pPr>
+        <w:tabs>
+          <w:tab w:val="left" w:pos="820"/>
+        </w:tabs>
+        <w:spacing w:before="205"/>
+        <w:rPr>
+          <w:lang w:val="vi-VN"/>
+        </w:rPr>
+      </w:pPr>
+      <w:r>
+        <w:rPr>
+          <w:lang w:val="vi-VN"/>
+        </w:rPr>
+        <w:t xml:space="preserve">    return $stmt-&gt;fetchAll(PDO::FETCH_ASSOC);</w:t>
+      </w:r>
+    </w:p>
+    <w:p>
+      <w:pPr>
+        <w:tabs>
+          <w:tab w:val="left" w:pos="820"/>
+        </w:tabs>
+        <w:spacing w:before="205"/>
+        <w:rPr>
+          <w:lang w:val="vi-VN"/>
+        </w:rPr>
+      </w:pPr>
+      <w:r>
+        <w:rPr>
+          <w:lang w:val="vi-VN"/>
+        </w:rPr>
+        <w:t>}</w:t>
+      </w:r>
+    </w:p>
+    <w:p>
+      <w:pPr>
+        <w:tabs>
+          <w:tab w:val="left" w:pos="820"/>
+        </w:tabs>
+        <w:spacing w:before="205"/>
+        <w:rPr>
+          <w:lang w:val="vi-VN"/>
+        </w:rPr>
+      </w:pPr>
+    </w:p>
+    <w:p>
+      <w:pPr>
+        <w:tabs>
+          <w:tab w:val="left" w:pos="820"/>
+        </w:tabs>
+        <w:spacing w:before="205"/>
+        <w:rPr>
+          <w:lang w:val="vi-VN"/>
+        </w:rPr>
+      </w:pPr>
+      <w:r>
+        <w:rPr>
+          <w:lang w:val="vi-VN"/>
+        </w:rPr>
+        <w:t>function addSinhVien($pdo, $ten, $email) {</w:t>
+      </w:r>
+    </w:p>
+    <w:p>
+      <w:pPr>
+        <w:tabs>
+          <w:tab w:val="left" w:pos="820"/>
+        </w:tabs>
+        <w:spacing w:before="205"/>
+        <w:rPr>
+          <w:lang w:val="vi-VN"/>
+        </w:rPr>
+      </w:pPr>
+      <w:r>
+        <w:rPr>
+          <w:lang w:val="vi-VN"/>
+        </w:rPr>
+        <w:t xml:space="preserve">    // Sử dụng Prepared Statement giống Chương 4</w:t>
+      </w:r>
+    </w:p>
+    <w:p>
+      <w:pPr>
+        <w:tabs>
+          <w:tab w:val="left" w:pos="820"/>
+        </w:tabs>
+        <w:spacing w:before="205"/>
+        <w:rPr>
+          <w:lang w:val="vi-VN"/>
+        </w:rPr>
+      </w:pPr>
+      <w:r>
+        <w:rPr>
+          <w:lang w:val="vi-VN"/>
+        </w:rPr>
+        <w:t xml:space="preserve">    $sql = "INSERT INTO sinhvien (ten_sinh_vien, email) VALUES (?, ?)";</w:t>
+      </w:r>
+    </w:p>
+    <w:p>
+      <w:pPr>
+        <w:tabs>
+          <w:tab w:val="left" w:pos="820"/>
+        </w:tabs>
+        <w:spacing w:before="205"/>
+        <w:rPr>
+          <w:lang w:val="vi-VN"/>
+        </w:rPr>
+      </w:pPr>
+      <w:r>
+        <w:rPr>
+          <w:lang w:val="vi-VN"/>
+        </w:rPr>
+        <w:t xml:space="preserve">    $stmt = $pdo-&gt;prepare($sql);</w:t>
+      </w:r>
+    </w:p>
+    <w:p>
+      <w:pPr>
+        <w:tabs>
+          <w:tab w:val="left" w:pos="820"/>
+        </w:tabs>
+        <w:spacing w:before="205"/>
+        <w:rPr>
+          <w:lang w:val="vi-VN"/>
+        </w:rPr>
+      </w:pPr>
+      <w:r>
+        <w:rPr>
+          <w:lang w:val="vi-VN"/>
+        </w:rPr>
+        <w:t xml:space="preserve">    $stmt-&gt;execute([$ten, $email]);</w:t>
+      </w:r>
+    </w:p>
+    <w:p>
+      <w:pPr>
+        <w:tabs>
+          <w:tab w:val="left" w:pos="820"/>
+        </w:tabs>
+        <w:spacing w:before="205"/>
+        <w:rPr>
+          <w:lang w:val="vi-VN"/>
+        </w:rPr>
+      </w:pPr>
+      <w:r>
+        <w:rPr>
+          <w:lang w:val="vi-VN"/>
+        </w:rPr>
+        <w:t>}</w:t>
+      </w:r>
+    </w:p>
+    <w:p>
+      <w:pPr>
+        <w:tabs>
+          <w:tab w:val="left" w:pos="820"/>
+        </w:tabs>
+        <w:spacing w:before="205"/>
+        <w:rPr>
+          <w:lang w:val="vi-VN"/>
+        </w:rPr>
+      </w:pPr>
+      <w:r>
+        <w:rPr>
+          <w:lang w:val="vi-VN"/>
+        </w:rPr>
+        <w:t>?&gt;</w:t>
+      </w:r>
+    </w:p>
+    <w:p>
+      <w:pPr>
         <w:pStyle w:val="ListParagraph"/>
         <w:numPr>
           <w:ilvl w:val="1"/>
@@ -19107,6 +19367,750 @@
           <w:spacing w:val="-2"/>
         </w:rPr>
         <w:t>views/sinhvien_view.php</w:t>
+      </w:r>
+    </w:p>
+    <w:p>
+      <w:pPr>
+        <w:tabs>
+          <w:tab w:val="left" w:pos="820"/>
+        </w:tabs>
+        <w:spacing w:before="203"/>
+        <w:rPr>
+          <w:lang w:val="vi-VN"/>
+        </w:rPr>
+      </w:pPr>
+      <w:r>
+        <w:rPr>
+          <w:lang w:val="vi-VN"/>
+        </w:rPr>
+        <w:t>&lt;!DOCTYPE html&gt;</w:t>
+      </w:r>
+    </w:p>
+    <w:p>
+      <w:pPr>
+        <w:tabs>
+          <w:tab w:val="left" w:pos="820"/>
+        </w:tabs>
+        <w:spacing w:before="203"/>
+        <w:rPr>
+          <w:lang w:val="vi-VN"/>
+        </w:rPr>
+      </w:pPr>
+      <w:r>
+        <w:rPr>
+          <w:lang w:val="vi-VN"/>
+        </w:rPr>
+        <w:t>&lt;html lang="vi"&gt;</w:t>
+      </w:r>
+    </w:p>
+    <w:p>
+      <w:pPr>
+        <w:tabs>
+          <w:tab w:val="left" w:pos="820"/>
+        </w:tabs>
+        <w:spacing w:before="203"/>
+        <w:rPr>
+          <w:lang w:val="vi-VN"/>
+        </w:rPr>
+      </w:pPr>
+      <w:r>
+        <w:rPr>
+          <w:lang w:val="vi-VN"/>
+        </w:rPr>
+        <w:t>&lt;head&gt;</w:t>
+      </w:r>
+    </w:p>
+    <w:p>
+      <w:pPr>
+        <w:tabs>
+          <w:tab w:val="left" w:pos="820"/>
+        </w:tabs>
+        <w:spacing w:before="203"/>
+        <w:rPr>
+          <w:lang w:val="vi-VN"/>
+        </w:rPr>
+      </w:pPr>
+      <w:r>
+        <w:rPr>
+          <w:lang w:val="vi-VN"/>
+        </w:rPr>
+        <w:t xml:space="preserve">    &lt;meta charset="UTF-8"&gt;</w:t>
+      </w:r>
+    </w:p>
+    <w:p>
+      <w:pPr>
+        <w:tabs>
+          <w:tab w:val="left" w:pos="820"/>
+        </w:tabs>
+        <w:spacing w:before="203"/>
+        <w:rPr>
+          <w:lang w:val="vi-VN"/>
+        </w:rPr>
+      </w:pPr>
+      <w:r>
+        <w:rPr>
+          <w:lang w:val="vi-VN"/>
+        </w:rPr>
+        <w:t xml:space="preserve">    &lt;title&gt;PHT Chương 5 - MVC&lt;/title&gt;</w:t>
+      </w:r>
+    </w:p>
+    <w:p>
+      <w:pPr>
+        <w:tabs>
+          <w:tab w:val="left" w:pos="820"/>
+        </w:tabs>
+        <w:spacing w:before="203"/>
+        <w:rPr>
+          <w:lang w:val="vi-VN"/>
+        </w:rPr>
+      </w:pPr>
+      <w:r>
+        <w:rPr>
+          <w:lang w:val="vi-VN"/>
+        </w:rPr>
+        <w:t xml:space="preserve">    &lt;style&gt;</w:t>
+      </w:r>
+    </w:p>
+    <w:p>
+      <w:pPr>
+        <w:tabs>
+          <w:tab w:val="left" w:pos="820"/>
+        </w:tabs>
+        <w:spacing w:before="203"/>
+        <w:rPr>
+          <w:lang w:val="vi-VN"/>
+        </w:rPr>
+      </w:pPr>
+      <w:r>
+        <w:rPr>
+          <w:lang w:val="vi-VN"/>
+        </w:rPr>
+        <w:t xml:space="preserve">        table { width: 100%; border-collapse: collapse; margin-top: 20px;}</w:t>
+      </w:r>
+    </w:p>
+    <w:p>
+      <w:pPr>
+        <w:tabs>
+          <w:tab w:val="left" w:pos="820"/>
+        </w:tabs>
+        <w:spacing w:before="203"/>
+        <w:rPr>
+          <w:lang w:val="vi-VN"/>
+        </w:rPr>
+      </w:pPr>
+      <w:r>
+        <w:rPr>
+          <w:lang w:val="vi-VN"/>
+        </w:rPr>
+        <w:t xml:space="preserve">        th, td { border: 1px solid #ddd; padding: 8px; }</w:t>
+      </w:r>
+    </w:p>
+    <w:p>
+      <w:pPr>
+        <w:tabs>
+          <w:tab w:val="left" w:pos="820"/>
+        </w:tabs>
+        <w:spacing w:before="203"/>
+        <w:rPr>
+          <w:lang w:val="vi-VN"/>
+        </w:rPr>
+      </w:pPr>
+      <w:r>
+        <w:rPr>
+          <w:lang w:val="vi-VN"/>
+        </w:rPr>
+        <w:t xml:space="preserve">        th { background-color: #f2f2f2; }</w:t>
+      </w:r>
+    </w:p>
+    <w:p>
+      <w:pPr>
+        <w:tabs>
+          <w:tab w:val="left" w:pos="820"/>
+        </w:tabs>
+        <w:spacing w:before="203"/>
+        <w:rPr>
+          <w:lang w:val="vi-VN"/>
+        </w:rPr>
+      </w:pPr>
+      <w:r>
+        <w:rPr>
+          <w:lang w:val="vi-VN"/>
+        </w:rPr>
+        <w:t xml:space="preserve">    &lt;/style&gt;</w:t>
+      </w:r>
+    </w:p>
+    <w:p>
+      <w:pPr>
+        <w:tabs>
+          <w:tab w:val="left" w:pos="820"/>
+        </w:tabs>
+        <w:spacing w:before="203"/>
+        <w:rPr>
+          <w:lang w:val="vi-VN"/>
+        </w:rPr>
+      </w:pPr>
+      <w:r>
+        <w:rPr>
+          <w:lang w:val="vi-VN"/>
+        </w:rPr>
+        <w:lastRenderedPageBreak/>
+        <w:t>&lt;/head&gt;</w:t>
+      </w:r>
+    </w:p>
+    <w:p>
+      <w:pPr>
+        <w:tabs>
+          <w:tab w:val="left" w:pos="820"/>
+        </w:tabs>
+        <w:spacing w:before="203"/>
+        <w:rPr>
+          <w:lang w:val="vi-VN"/>
+        </w:rPr>
+      </w:pPr>
+      <w:r>
+        <w:rPr>
+          <w:lang w:val="vi-VN"/>
+        </w:rPr>
+        <w:t>&lt;body&gt;</w:t>
+      </w:r>
+    </w:p>
+    <w:p>
+      <w:pPr>
+        <w:tabs>
+          <w:tab w:val="left" w:pos="820"/>
+        </w:tabs>
+        <w:spacing w:before="203"/>
+        <w:rPr>
+          <w:lang w:val="vi-VN"/>
+        </w:rPr>
+      </w:pPr>
+      <w:r>
+        <w:rPr>
+          <w:lang w:val="vi-VN"/>
+        </w:rPr>
+        <w:t xml:space="preserve">    &lt;h2&gt;Thêm Sinh Viên Mới (Kiến trúc MVC)&lt;/h2&gt;</w:t>
+      </w:r>
+    </w:p>
+    <w:p>
+      <w:pPr>
+        <w:tabs>
+          <w:tab w:val="left" w:pos="820"/>
+        </w:tabs>
+        <w:spacing w:before="203"/>
+        <w:rPr>
+          <w:lang w:val="vi-VN"/>
+        </w:rPr>
+      </w:pPr>
+      <w:r>
+        <w:rPr>
+          <w:lang w:val="vi-VN"/>
+        </w:rPr>
+        <w:t xml:space="preserve">    &lt;form method="POST" action="index.php"&gt;</w:t>
+      </w:r>
+    </w:p>
+    <w:p>
+      <w:pPr>
+        <w:tabs>
+          <w:tab w:val="left" w:pos="820"/>
+        </w:tabs>
+        <w:spacing w:before="203"/>
+        <w:rPr>
+          <w:lang w:val="vi-VN"/>
+        </w:rPr>
+      </w:pPr>
+      <w:r>
+        <w:rPr>
+          <w:lang w:val="vi-VN"/>
+        </w:rPr>
+        <w:t xml:space="preserve">        Tên sinh viên: &lt;input type="text" name="ten_sinh_vien" required&gt;</w:t>
+      </w:r>
+    </w:p>
+    <w:p>
+      <w:pPr>
+        <w:tabs>
+          <w:tab w:val="left" w:pos="820"/>
+        </w:tabs>
+        <w:spacing w:before="203"/>
+        <w:rPr>
+          <w:lang w:val="vi-VN"/>
+        </w:rPr>
+      </w:pPr>
+      <w:r>
+        <w:rPr>
+          <w:lang w:val="vi-VN"/>
+        </w:rPr>
+        <w:t xml:space="preserve">        Email: &lt;input type="email" name="email" required&gt;</w:t>
+      </w:r>
+    </w:p>
+    <w:p>
+      <w:pPr>
+        <w:tabs>
+          <w:tab w:val="left" w:pos="820"/>
+        </w:tabs>
+        <w:spacing w:before="203"/>
+        <w:rPr>
+          <w:lang w:val="vi-VN"/>
+        </w:rPr>
+      </w:pPr>
+      <w:r>
+        <w:rPr>
+          <w:lang w:val="vi-VN"/>
+        </w:rPr>
+        <w:t xml:space="preserve">        &lt;button type="submit"&gt;Thêm sinh viên&lt;/button&gt;</w:t>
+      </w:r>
+    </w:p>
+    <w:p>
+      <w:pPr>
+        <w:tabs>
+          <w:tab w:val="left" w:pos="820"/>
+        </w:tabs>
+        <w:spacing w:before="203"/>
+        <w:rPr>
+          <w:lang w:val="vi-VN"/>
+        </w:rPr>
+      </w:pPr>
+      <w:r>
+        <w:rPr>
+          <w:lang w:val="vi-VN"/>
+        </w:rPr>
+        <w:t xml:space="preserve">    &lt;/form&gt;</w:t>
+      </w:r>
+    </w:p>
+    <w:p>
+      <w:pPr>
+        <w:tabs>
+          <w:tab w:val="left" w:pos="820"/>
+        </w:tabs>
+        <w:spacing w:before="203"/>
+        <w:rPr>
+          <w:lang w:val="vi-VN"/>
+        </w:rPr>
+      </w:pPr>
+    </w:p>
+    <w:p>
+      <w:pPr>
+        <w:tabs>
+          <w:tab w:val="left" w:pos="820"/>
+        </w:tabs>
+        <w:spacing w:before="203"/>
+        <w:rPr>
+          <w:lang w:val="vi-VN"/>
+        </w:rPr>
+      </w:pPr>
+      <w:r>
+        <w:rPr>
+          <w:lang w:val="vi-VN"/>
+        </w:rPr>
+        <w:t xml:space="preserve">    &lt;h2&gt;Danh Sách Sinh Viên (Kiến trúc MVC)&lt;/h2&gt;</w:t>
+      </w:r>
+    </w:p>
+    <w:p>
+      <w:pPr>
+        <w:tabs>
+          <w:tab w:val="left" w:pos="820"/>
+        </w:tabs>
+        <w:spacing w:before="203"/>
+        <w:rPr>
+          <w:lang w:val="vi-VN"/>
+        </w:rPr>
+      </w:pPr>
+      <w:r>
+        <w:rPr>
+          <w:lang w:val="vi-VN"/>
+        </w:rPr>
+        <w:t xml:space="preserve">    &lt;table&gt;</w:t>
+      </w:r>
+    </w:p>
+    <w:p>
+      <w:pPr>
+        <w:tabs>
+          <w:tab w:val="left" w:pos="820"/>
+        </w:tabs>
+        <w:spacing w:before="203"/>
+        <w:rPr>
+          <w:lang w:val="vi-VN"/>
+        </w:rPr>
+      </w:pPr>
+      <w:r>
+        <w:rPr>
+          <w:lang w:val="vi-VN"/>
+        </w:rPr>
+        <w:t xml:space="preserve">        &lt;tr&gt;</w:t>
+      </w:r>
+    </w:p>
+    <w:p>
+      <w:pPr>
+        <w:tabs>
+          <w:tab w:val="left" w:pos="820"/>
+        </w:tabs>
+        <w:spacing w:before="203"/>
+        <w:rPr>
+          <w:lang w:val="vi-VN"/>
+        </w:rPr>
+      </w:pPr>
+      <w:r>
+        <w:rPr>
+          <w:lang w:val="vi-VN"/>
+        </w:rPr>
+        <w:t xml:space="preserve">            &lt;th&gt;ID&lt;/th&gt;</w:t>
+      </w:r>
+    </w:p>
+    <w:p>
+      <w:pPr>
+        <w:tabs>
+          <w:tab w:val="left" w:pos="820"/>
+        </w:tabs>
+        <w:spacing w:before="203"/>
+        <w:rPr>
+          <w:lang w:val="vi-VN"/>
+        </w:rPr>
+      </w:pPr>
+      <w:r>
+        <w:rPr>
+          <w:lang w:val="vi-VN"/>
+        </w:rPr>
+        <w:t xml:space="preserve">            &lt;th&gt;Tên Sinh Viên&lt;/th&gt;</w:t>
+      </w:r>
+    </w:p>
+    <w:p>
+      <w:pPr>
+        <w:tabs>
+          <w:tab w:val="left" w:pos="820"/>
+        </w:tabs>
+        <w:spacing w:before="203"/>
+        <w:rPr>
+          <w:lang w:val="vi-VN"/>
+        </w:rPr>
+      </w:pPr>
+      <w:r>
+        <w:rPr>
+          <w:lang w:val="vi-VN"/>
+        </w:rPr>
+        <w:t xml:space="preserve">            &lt;th&gt;Email&lt;/th&gt;</w:t>
+      </w:r>
+    </w:p>
+    <w:p>
+      <w:pPr>
+        <w:tabs>
+          <w:tab w:val="left" w:pos="820"/>
+        </w:tabs>
+        <w:spacing w:before="203"/>
+        <w:rPr>
+          <w:lang w:val="vi-VN"/>
+        </w:rPr>
+      </w:pPr>
+      <w:r>
+        <w:rPr>
+          <w:lang w:val="vi-VN"/>
+        </w:rPr>
+        <w:t xml:space="preserve">            &lt;th&gt;Ngày Tạo&lt;/th&gt;</w:t>
+      </w:r>
+    </w:p>
+    <w:p>
+      <w:pPr>
+        <w:tabs>
+          <w:tab w:val="left" w:pos="820"/>
+        </w:tabs>
+        <w:spacing w:before="203"/>
+        <w:rPr>
+          <w:lang w:val="vi-VN"/>
+        </w:rPr>
+      </w:pPr>
+      <w:r>
+        <w:rPr>
+          <w:lang w:val="vi-VN"/>
+        </w:rPr>
+        <w:t xml:space="preserve">        &lt;/tr&gt;</w:t>
+      </w:r>
+    </w:p>
+    <w:p>
+      <w:pPr>
+        <w:tabs>
+          <w:tab w:val="left" w:pos="820"/>
+        </w:tabs>
+        <w:spacing w:before="203"/>
+        <w:rPr>
+          <w:lang w:val="vi-VN"/>
+        </w:rPr>
+      </w:pPr>
+      <w:r>
+        <w:rPr>
+          <w:lang w:val="vi-VN"/>
+        </w:rPr>
+        <w:t xml:space="preserve">        &lt;?php</w:t>
+      </w:r>
+    </w:p>
+    <w:p>
+      <w:pPr>
+        <w:tabs>
+          <w:tab w:val="left" w:pos="820"/>
+        </w:tabs>
+        <w:spacing w:before="203"/>
+        <w:rPr>
+          <w:lang w:val="vi-VN"/>
+        </w:rPr>
+      </w:pPr>
+      <w:r>
+        <w:rPr>
+          <w:lang w:val="vi-VN"/>
+        </w:rPr>
+        <w:t xml:space="preserve">        // Biến $danh_sach_sv được Controller truyền sang</w:t>
+      </w:r>
+    </w:p>
+    <w:p>
+      <w:pPr>
+        <w:tabs>
+          <w:tab w:val="left" w:pos="820"/>
+        </w:tabs>
+        <w:spacing w:before="203"/>
+        <w:rPr>
+          <w:lang w:val="vi-VN"/>
+        </w:rPr>
+      </w:pPr>
+      <w:r>
+        <w:rPr>
+          <w:lang w:val="vi-VN"/>
+        </w:rPr>
+        <w:t xml:space="preserve">        if (!empty($danh_sach_sv)) {</w:t>
+      </w:r>
+    </w:p>
+    <w:p>
+      <w:pPr>
+        <w:tabs>
+          <w:tab w:val="left" w:pos="820"/>
+        </w:tabs>
+        <w:spacing w:before="203"/>
+        <w:rPr>
+          <w:lang w:val="vi-VN"/>
+        </w:rPr>
+      </w:pPr>
+      <w:r>
+        <w:rPr>
+          <w:lang w:val="vi-VN"/>
+        </w:rPr>
+        <w:t xml:space="preserve">            foreach ($danh_sach_sv as $sv) {</w:t>
+      </w:r>
+    </w:p>
+    <w:p>
+      <w:pPr>
+        <w:tabs>
+          <w:tab w:val="left" w:pos="820"/>
+        </w:tabs>
+        <w:spacing w:before="203"/>
+        <w:rPr>
+          <w:lang w:val="vi-VN"/>
+        </w:rPr>
+      </w:pPr>
+      <w:r>
+        <w:rPr>
+          <w:lang w:val="vi-VN"/>
+        </w:rPr>
+        <w:t xml:space="preserve">                echo "&lt;tr&gt;";</w:t>
+      </w:r>
+    </w:p>
+    <w:p>
+      <w:pPr>
+        <w:tabs>
+          <w:tab w:val="left" w:pos="820"/>
+        </w:tabs>
+        <w:spacing w:before="203"/>
+        <w:rPr>
+          <w:lang w:val="vi-VN"/>
+        </w:rPr>
+      </w:pPr>
+      <w:r>
+        <w:rPr>
+          <w:lang w:val="vi-VN"/>
+        </w:rPr>
+        <w:t xml:space="preserve">                echo "&lt;td&gt;" . htmlspecialchars($sv['id']) . "&lt;/td&gt;";</w:t>
+      </w:r>
+    </w:p>
+    <w:p>
+      <w:pPr>
+        <w:tabs>
+          <w:tab w:val="left" w:pos="820"/>
+        </w:tabs>
+        <w:spacing w:before="203"/>
+        <w:rPr>
+          <w:lang w:val="vi-VN"/>
+        </w:rPr>
+      </w:pPr>
+      <w:r>
+        <w:rPr>
+          <w:lang w:val="vi-VN"/>
+        </w:rPr>
+        <w:t xml:space="preserve">                echo "&lt;td&gt;" . htmlspecialchars($sv['ten_sinh_vien']) . "&lt;/td&gt;";</w:t>
+      </w:r>
+    </w:p>
+    <w:p>
+      <w:pPr>
+        <w:tabs>
+          <w:tab w:val="left" w:pos="820"/>
+        </w:tabs>
+        <w:spacing w:before="203"/>
+        <w:rPr>
+          <w:lang w:val="vi-VN"/>
+        </w:rPr>
+      </w:pPr>
+      <w:r>
+        <w:rPr>
+          <w:lang w:val="vi-VN"/>
+        </w:rPr>
+        <w:t xml:space="preserve">                echo "&lt;td&gt;" . htmlspecialchars($sv['email']) . "&lt;/td&gt;";</w:t>
+      </w:r>
+    </w:p>
+    <w:p>
+      <w:pPr>
+        <w:tabs>
+          <w:tab w:val="left" w:pos="820"/>
+        </w:tabs>
+        <w:spacing w:before="203"/>
+        <w:rPr>
+          <w:lang w:val="vi-VN"/>
+        </w:rPr>
+      </w:pPr>
+      <w:r>
+        <w:rPr>
+          <w:lang w:val="vi-VN"/>
+        </w:rPr>
+        <w:t xml:space="preserve">                // Sửa lại tên cột ngay_tao để khớp với database Chương 4</w:t>
+      </w:r>
+    </w:p>
+    <w:p>
+      <w:pPr>
+        <w:tabs>
+          <w:tab w:val="left" w:pos="820"/>
+        </w:tabs>
+        <w:spacing w:before="203"/>
+        <w:rPr>
+          <w:lang w:val="vi-VN"/>
+        </w:rPr>
+      </w:pPr>
+      <w:r>
+        <w:rPr>
+          <w:lang w:val="vi-VN"/>
+        </w:rPr>
+        <w:t xml:space="preserve">                echo "&lt;td&gt;" . htmlspecialchars($sv['ngay_tao']) . "&lt;/td&gt;";</w:t>
+      </w:r>
+    </w:p>
+    <w:p>
+      <w:pPr>
+        <w:tabs>
+          <w:tab w:val="left" w:pos="820"/>
+        </w:tabs>
+        <w:spacing w:before="203"/>
+        <w:rPr>
+          <w:lang w:val="vi-VN"/>
+        </w:rPr>
+      </w:pPr>
+      <w:r>
+        <w:rPr>
+          <w:lang w:val="vi-VN"/>
+        </w:rPr>
+        <w:t xml:space="preserve">                echo "&lt;/tr&gt;";</w:t>
+      </w:r>
+    </w:p>
+    <w:p>
+      <w:pPr>
+        <w:tabs>
+          <w:tab w:val="left" w:pos="820"/>
+        </w:tabs>
+        <w:spacing w:before="203"/>
+        <w:rPr>
+          <w:lang w:val="vi-VN"/>
+        </w:rPr>
+      </w:pPr>
+      <w:r>
+        <w:rPr>
+          <w:lang w:val="vi-VN"/>
+        </w:rPr>
+        <w:t xml:space="preserve">            }</w:t>
+      </w:r>
+    </w:p>
+    <w:p>
+      <w:pPr>
+        <w:tabs>
+          <w:tab w:val="left" w:pos="820"/>
+        </w:tabs>
+        <w:spacing w:before="203"/>
+        <w:rPr>
+          <w:lang w:val="vi-VN"/>
+        </w:rPr>
+      </w:pPr>
+      <w:r>
+        <w:rPr>
+          <w:lang w:val="vi-VN"/>
+        </w:rPr>
+        <w:t xml:space="preserve">        }</w:t>
+      </w:r>
+    </w:p>
+    <w:p>
+      <w:pPr>
+        <w:tabs>
+          <w:tab w:val="left" w:pos="820"/>
+        </w:tabs>
+        <w:spacing w:before="203"/>
+        <w:rPr>
+          <w:lang w:val="vi-VN"/>
+        </w:rPr>
+      </w:pPr>
+      <w:r>
+        <w:rPr>
+          <w:lang w:val="vi-VN"/>
+        </w:rPr>
+        <w:t xml:space="preserve">        ?&gt;</w:t>
+      </w:r>
+    </w:p>
+    <w:p>
+      <w:pPr>
+        <w:tabs>
+          <w:tab w:val="left" w:pos="820"/>
+        </w:tabs>
+        <w:spacing w:before="203"/>
+        <w:rPr>
+          <w:lang w:val="vi-VN"/>
+        </w:rPr>
+      </w:pPr>
+      <w:r>
+        <w:rPr>
+          <w:lang w:val="vi-VN"/>
+        </w:rPr>
+        <w:t xml:space="preserve">    &lt;/table&gt;</w:t>
+      </w:r>
+    </w:p>
+    <w:p>
+      <w:pPr>
+        <w:tabs>
+          <w:tab w:val="left" w:pos="820"/>
+        </w:tabs>
+        <w:spacing w:before="203"/>
+        <w:rPr>
+          <w:lang w:val="vi-VN"/>
+        </w:rPr>
+      </w:pPr>
+      <w:r>
+        <w:rPr>
+          <w:lang w:val="vi-VN"/>
+        </w:rPr>
+        <w:lastRenderedPageBreak/>
+        <w:t>&lt;/body&gt;</w:t>
+      </w:r>
+    </w:p>
+    <w:p>
+      <w:pPr>
+        <w:tabs>
+          <w:tab w:val="left" w:pos="820"/>
+        </w:tabs>
+        <w:spacing w:before="203"/>
+        <w:rPr>
+          <w:lang w:val="vi-VN"/>
+        </w:rPr>
+      </w:pPr>
+      <w:r>
+        <w:rPr>
+          <w:lang w:val="vi-VN"/>
+        </w:rPr>
+        <w:t>&lt;/html&gt;</w:t>
       </w:r>
     </w:p>
     <w:p>
@@ -19131,6 +20135,576 @@
     </w:p>
     <w:p>
       <w:pPr>
+        <w:tabs>
+          <w:tab w:val="left" w:pos="820"/>
+        </w:tabs>
+        <w:spacing w:before="207"/>
+        <w:rPr>
+          <w:lang w:val="vi-VN"/>
+        </w:rPr>
+      </w:pPr>
+      <w:r>
+        <w:rPr>
+          <w:lang w:val="vi-VN"/>
+        </w:rPr>
+        <w:t>&lt;?php</w:t>
+      </w:r>
+    </w:p>
+    <w:p>
+      <w:pPr>
+        <w:tabs>
+          <w:tab w:val="left" w:pos="820"/>
+        </w:tabs>
+        <w:spacing w:before="207"/>
+        <w:rPr>
+          <w:lang w:val="vi-VN"/>
+        </w:rPr>
+      </w:pPr>
+      <w:r>
+        <w:rPr>
+          <w:lang w:val="vi-VN"/>
+        </w:rPr>
+        <w:t>// Import Model để sử dụng các hàm truy vấn</w:t>
+      </w:r>
+    </w:p>
+    <w:p>
+      <w:pPr>
+        <w:tabs>
+          <w:tab w:val="left" w:pos="820"/>
+        </w:tabs>
+        <w:spacing w:before="207"/>
+        <w:rPr>
+          <w:lang w:val="vi-VN"/>
+        </w:rPr>
+      </w:pPr>
+      <w:r>
+        <w:rPr>
+          <w:lang w:val="vi-VN"/>
+        </w:rPr>
+        <w:t>require_once 'models/SinhVienModel.php';</w:t>
+      </w:r>
+    </w:p>
+    <w:p>
+      <w:pPr>
+        <w:tabs>
+          <w:tab w:val="left" w:pos="820"/>
+        </w:tabs>
+        <w:spacing w:before="207"/>
+        <w:rPr>
+          <w:lang w:val="vi-VN"/>
+        </w:rPr>
+      </w:pPr>
+    </w:p>
+    <w:p>
+      <w:pPr>
+        <w:tabs>
+          <w:tab w:val="left" w:pos="820"/>
+        </w:tabs>
+        <w:spacing w:before="207"/>
+        <w:rPr>
+          <w:lang w:val="vi-VN"/>
+        </w:rPr>
+      </w:pPr>
+      <w:r>
+        <w:rPr>
+          <w:lang w:val="vi-VN"/>
+        </w:rPr>
+        <w:t>$host = '127.0.0.1';</w:t>
+      </w:r>
+    </w:p>
+    <w:p>
+      <w:pPr>
+        <w:tabs>
+          <w:tab w:val="left" w:pos="820"/>
+        </w:tabs>
+        <w:spacing w:before="207"/>
+        <w:rPr>
+          <w:lang w:val="vi-VN"/>
+        </w:rPr>
+      </w:pPr>
+      <w:r>
+        <w:rPr>
+          <w:lang w:val="vi-VN"/>
+        </w:rPr>
+        <w:t>$dbname = 'cse485_web';</w:t>
+      </w:r>
+    </w:p>
+    <w:p>
+      <w:pPr>
+        <w:tabs>
+          <w:tab w:val="left" w:pos="820"/>
+        </w:tabs>
+        <w:spacing w:before="207"/>
+        <w:rPr>
+          <w:lang w:val="vi-VN"/>
+        </w:rPr>
+      </w:pPr>
+      <w:r>
+        <w:rPr>
+          <w:lang w:val="vi-VN"/>
+        </w:rPr>
+        <w:t>$username = 'root';</w:t>
+      </w:r>
+    </w:p>
+    <w:p>
+      <w:pPr>
+        <w:tabs>
+          <w:tab w:val="left" w:pos="820"/>
+        </w:tabs>
+        <w:spacing w:before="207"/>
+        <w:rPr>
+          <w:lang w:val="vi-VN"/>
+        </w:rPr>
+      </w:pPr>
+      <w:r>
+        <w:rPr>
+          <w:lang w:val="vi-VN"/>
+        </w:rPr>
+        <w:t>$password = '';</w:t>
+      </w:r>
+    </w:p>
+    <w:p>
+      <w:pPr>
+        <w:tabs>
+          <w:tab w:val="left" w:pos="820"/>
+        </w:tabs>
+        <w:spacing w:before="207"/>
+        <w:rPr>
+          <w:lang w:val="vi-VN"/>
+        </w:rPr>
+      </w:pPr>
+      <w:r>
+        <w:rPr>
+          <w:lang w:val="vi-VN"/>
+        </w:rPr>
+        <w:t>$dsn = "mysql:host=$host;dbname=$dbname;charset=utf8mb4";</w:t>
+      </w:r>
+    </w:p>
+    <w:p>
+      <w:pPr>
+        <w:tabs>
+          <w:tab w:val="left" w:pos="820"/>
+        </w:tabs>
+        <w:spacing w:before="207"/>
+        <w:rPr>
+          <w:lang w:val="vi-VN"/>
+        </w:rPr>
+      </w:pPr>
+    </w:p>
+    <w:p>
+      <w:pPr>
+        <w:tabs>
+          <w:tab w:val="left" w:pos="820"/>
+        </w:tabs>
+        <w:spacing w:before="207"/>
+        <w:rPr>
+          <w:lang w:val="vi-VN"/>
+        </w:rPr>
+      </w:pPr>
+      <w:r>
+        <w:rPr>
+          <w:lang w:val="vi-VN"/>
+        </w:rPr>
+        <w:t>try {</w:t>
+      </w:r>
+    </w:p>
+    <w:p>
+      <w:pPr>
+        <w:tabs>
+          <w:tab w:val="left" w:pos="820"/>
+        </w:tabs>
+        <w:spacing w:before="207"/>
+        <w:rPr>
+          <w:lang w:val="vi-VN"/>
+        </w:rPr>
+      </w:pPr>
+      <w:r>
+        <w:rPr>
+          <w:lang w:val="vi-VN"/>
+        </w:rPr>
+        <w:t xml:space="preserve">    $pdo = new PDO($dsn, $username, $password);</w:t>
+      </w:r>
+    </w:p>
+    <w:p>
+      <w:pPr>
+        <w:tabs>
+          <w:tab w:val="left" w:pos="820"/>
+        </w:tabs>
+        <w:spacing w:before="207"/>
+        <w:rPr>
+          <w:lang w:val="vi-VN"/>
+        </w:rPr>
+      </w:pPr>
+      <w:r>
+        <w:rPr>
+          <w:lang w:val="vi-VN"/>
+        </w:rPr>
+        <w:t xml:space="preserve">    $pdo-&gt;setAttribute(PDO::ATTR_ERRMODE, PDO::ERRMODE_EXCEPTION);</w:t>
+      </w:r>
+    </w:p>
+    <w:p>
+      <w:pPr>
+        <w:tabs>
+          <w:tab w:val="left" w:pos="820"/>
+        </w:tabs>
+        <w:spacing w:before="207"/>
+        <w:rPr>
+          <w:lang w:val="vi-VN"/>
+        </w:rPr>
+      </w:pPr>
+      <w:r>
+        <w:rPr>
+          <w:lang w:val="vi-VN"/>
+        </w:rPr>
+        <w:t>} catch (PDOException $e) {</w:t>
+      </w:r>
+    </w:p>
+    <w:p>
+      <w:pPr>
+        <w:tabs>
+          <w:tab w:val="left" w:pos="820"/>
+        </w:tabs>
+        <w:spacing w:before="207"/>
+        <w:rPr>
+          <w:lang w:val="vi-VN"/>
+        </w:rPr>
+      </w:pPr>
+      <w:r>
+        <w:rPr>
+          <w:lang w:val="vi-VN"/>
+        </w:rPr>
+        <w:t xml:space="preserve">    die("Kết nối thất bại: " . $e-&gt;getMessage());</w:t>
+      </w:r>
+    </w:p>
+    <w:p>
+      <w:pPr>
+        <w:tabs>
+          <w:tab w:val="left" w:pos="820"/>
+        </w:tabs>
+        <w:spacing w:before="207"/>
+        <w:rPr>
+          <w:lang w:val="vi-VN"/>
+        </w:rPr>
+      </w:pPr>
+      <w:r>
+        <w:rPr>
+          <w:lang w:val="vi-VN"/>
+        </w:rPr>
+        <w:t>}</w:t>
+      </w:r>
+    </w:p>
+    <w:p>
+      <w:pPr>
+        <w:tabs>
+          <w:tab w:val="left" w:pos="820"/>
+        </w:tabs>
+        <w:spacing w:before="207"/>
+        <w:rPr>
+          <w:lang w:val="vi-VN"/>
+        </w:rPr>
+      </w:pPr>
+    </w:p>
+    <w:p>
+      <w:pPr>
+        <w:tabs>
+          <w:tab w:val="left" w:pos="820"/>
+        </w:tabs>
+        <w:spacing w:before="207"/>
+        <w:rPr>
+          <w:lang w:val="vi-VN"/>
+        </w:rPr>
+      </w:pPr>
+      <w:r>
+        <w:rPr>
+          <w:lang w:val="vi-VN"/>
+        </w:rPr>
+        <w:t>// Xử lý thêm sinh viên</w:t>
+      </w:r>
+    </w:p>
+    <w:p>
+      <w:pPr>
+        <w:tabs>
+          <w:tab w:val="left" w:pos="820"/>
+        </w:tabs>
+        <w:spacing w:before="207"/>
+        <w:rPr>
+          <w:lang w:val="vi-VN"/>
+        </w:rPr>
+      </w:pPr>
+      <w:r>
+        <w:rPr>
+          <w:lang w:val="vi-VN"/>
+        </w:rPr>
+        <w:t>if (isset($_POST['ten_sinh_vien']) &amp;&amp; isset($_POST['email'])) {</w:t>
+      </w:r>
+    </w:p>
+    <w:p>
+      <w:pPr>
+        <w:tabs>
+          <w:tab w:val="left" w:pos="820"/>
+        </w:tabs>
+        <w:spacing w:before="207"/>
+        <w:rPr>
+          <w:lang w:val="vi-VN"/>
+        </w:rPr>
+      </w:pPr>
+      <w:r>
+        <w:rPr>
+          <w:lang w:val="vi-VN"/>
+        </w:rPr>
+        <w:t xml:space="preserve">    $ten = $_POST['ten_sinh_vien'];</w:t>
+      </w:r>
+    </w:p>
+    <w:p>
+      <w:pPr>
+        <w:tabs>
+          <w:tab w:val="left" w:pos="820"/>
+        </w:tabs>
+        <w:spacing w:before="207"/>
+        <w:rPr>
+          <w:lang w:val="vi-VN"/>
+        </w:rPr>
+      </w:pPr>
+      <w:r>
+        <w:rPr>
+          <w:lang w:val="vi-VN"/>
+        </w:rPr>
+        <w:t xml:space="preserve">    $email = $_POST['email'];</w:t>
+      </w:r>
+    </w:p>
+    <w:p>
+      <w:pPr>
+        <w:tabs>
+          <w:tab w:val="left" w:pos="820"/>
+        </w:tabs>
+        <w:spacing w:before="207"/>
+        <w:rPr>
+          <w:lang w:val="vi-VN"/>
+        </w:rPr>
+      </w:pPr>
+    </w:p>
+    <w:p>
+      <w:pPr>
+        <w:tabs>
+          <w:tab w:val="left" w:pos="820"/>
+        </w:tabs>
+        <w:spacing w:before="207"/>
+        <w:rPr>
+          <w:lang w:val="vi-VN"/>
+        </w:rPr>
+      </w:pPr>
+      <w:r>
+        <w:rPr>
+          <w:lang w:val="vi-VN"/>
+        </w:rPr>
+        <w:t xml:space="preserve">    // Gọi hàm từ Model thay vì viết SQL trực tiếp</w:t>
+      </w:r>
+    </w:p>
+    <w:p>
+      <w:pPr>
+        <w:tabs>
+          <w:tab w:val="left" w:pos="820"/>
+        </w:tabs>
+        <w:spacing w:before="207"/>
+        <w:rPr>
+          <w:lang w:val="vi-VN"/>
+        </w:rPr>
+      </w:pPr>
+      <w:r>
+        <w:rPr>
+          <w:lang w:val="vi-VN"/>
+        </w:rPr>
+        <w:t xml:space="preserve">    addSinhVien($pdo, $ten, $email);</w:t>
+      </w:r>
+    </w:p>
+    <w:p>
+      <w:pPr>
+        <w:tabs>
+          <w:tab w:val="left" w:pos="820"/>
+        </w:tabs>
+        <w:spacing w:before="207"/>
+        <w:rPr>
+          <w:lang w:val="vi-VN"/>
+        </w:rPr>
+      </w:pPr>
+    </w:p>
+    <w:p>
+      <w:pPr>
+        <w:tabs>
+          <w:tab w:val="left" w:pos="820"/>
+        </w:tabs>
+        <w:spacing w:before="207"/>
+        <w:rPr>
+          <w:lang w:val="vi-VN"/>
+        </w:rPr>
+      </w:pPr>
+      <w:r>
+        <w:rPr>
+          <w:lang w:val="vi-VN"/>
+        </w:rPr>
+        <w:t xml:space="preserve">    // Chuyển hướng về index.php (Controller) thay vì file cũ</w:t>
+      </w:r>
+    </w:p>
+    <w:p>
+      <w:pPr>
+        <w:tabs>
+          <w:tab w:val="left" w:pos="820"/>
+        </w:tabs>
+        <w:spacing w:before="207"/>
+        <w:rPr>
+          <w:lang w:val="vi-VN"/>
+        </w:rPr>
+      </w:pPr>
+      <w:r>
+        <w:rPr>
+          <w:lang w:val="vi-VN"/>
+        </w:rPr>
+        <w:t xml:space="preserve">    header('Location: index.php');</w:t>
+      </w:r>
+    </w:p>
+    <w:p>
+      <w:pPr>
+        <w:tabs>
+          <w:tab w:val="left" w:pos="820"/>
+        </w:tabs>
+        <w:spacing w:before="207"/>
+        <w:rPr>
+          <w:lang w:val="vi-VN"/>
+        </w:rPr>
+      </w:pPr>
+      <w:r>
+        <w:rPr>
+          <w:lang w:val="vi-VN"/>
+        </w:rPr>
+        <w:t xml:space="preserve">    exit;</w:t>
+      </w:r>
+    </w:p>
+    <w:p>
+      <w:pPr>
+        <w:tabs>
+          <w:tab w:val="left" w:pos="820"/>
+        </w:tabs>
+        <w:spacing w:before="207"/>
+        <w:rPr>
+          <w:lang w:val="vi-VN"/>
+        </w:rPr>
+      </w:pPr>
+      <w:r>
+        <w:rPr>
+          <w:lang w:val="vi-VN"/>
+        </w:rPr>
+        <w:t>}</w:t>
+      </w:r>
+    </w:p>
+    <w:p>
+      <w:pPr>
+        <w:tabs>
+          <w:tab w:val="left" w:pos="820"/>
+        </w:tabs>
+        <w:spacing w:before="207"/>
+        <w:rPr>
+          <w:lang w:val="vi-VN"/>
+        </w:rPr>
+      </w:pPr>
+    </w:p>
+    <w:p>
+      <w:pPr>
+        <w:tabs>
+          <w:tab w:val="left" w:pos="820"/>
+        </w:tabs>
+        <w:spacing w:before="207"/>
+        <w:rPr>
+          <w:lang w:val="vi-VN"/>
+        </w:rPr>
+      </w:pPr>
+      <w:r>
+        <w:rPr>
+          <w:lang w:val="vi-VN"/>
+        </w:rPr>
+        <w:t>// Lấy danh sách để hiển thị</w:t>
+      </w:r>
+    </w:p>
+    <w:p>
+      <w:pPr>
+        <w:tabs>
+          <w:tab w:val="left" w:pos="820"/>
+        </w:tabs>
+        <w:spacing w:before="207"/>
+        <w:rPr>
+          <w:lang w:val="vi-VN"/>
+        </w:rPr>
+      </w:pPr>
+      <w:r>
+        <w:rPr>
+          <w:lang w:val="vi-VN"/>
+        </w:rPr>
+        <w:t>$danh_sach_sv = getAllSinhVien($pdo);</w:t>
+      </w:r>
+    </w:p>
+    <w:p>
+      <w:pPr>
+        <w:tabs>
+          <w:tab w:val="left" w:pos="820"/>
+        </w:tabs>
+        <w:spacing w:before="207"/>
+        <w:rPr>
+          <w:lang w:val="vi-VN"/>
+        </w:rPr>
+      </w:pPr>
+    </w:p>
+    <w:p>
+      <w:pPr>
+        <w:tabs>
+          <w:tab w:val="left" w:pos="820"/>
+        </w:tabs>
+        <w:spacing w:before="207"/>
+        <w:rPr>
+          <w:lang w:val="vi-VN"/>
+        </w:rPr>
+      </w:pPr>
+      <w:r>
+        <w:rPr>
+          <w:lang w:val="vi-VN"/>
+        </w:rPr>
+        <w:t>// Nạp View ở cuối cùng để hiển thị giao diện</w:t>
+      </w:r>
+    </w:p>
+    <w:p>
+      <w:pPr>
+        <w:tabs>
+          <w:tab w:val="left" w:pos="820"/>
+        </w:tabs>
+        <w:spacing w:before="207"/>
+        <w:rPr>
+          <w:lang w:val="vi-VN"/>
+        </w:rPr>
+      </w:pPr>
+      <w:r>
+        <w:rPr>
+          <w:lang w:val="vi-VN"/>
+        </w:rPr>
+        <w:t>include 'views/sinhvien_view.php';</w:t>
+      </w:r>
+    </w:p>
+    <w:p>
+      <w:pPr>
+        <w:tabs>
+          <w:tab w:val="left" w:pos="820"/>
+        </w:tabs>
+        <w:spacing w:before="207"/>
+        <w:rPr>
+          <w:lang w:val="vi-VN"/>
+        </w:rPr>
+      </w:pPr>
+      <w:r>
+        <w:rPr>
+          <w:lang w:val="vi-VN"/>
+        </w:rPr>
+        <w:t>?&gt;</w:t>
+      </w:r>
+    </w:p>
+    <w:p>
+      <w:pPr>
         <w:pStyle w:val="ListParagraph"/>
         <w:numPr>
           <w:ilvl w:val="0"/>
@@ -19768,172 +21342,9 @@
       </w:pPr>
       <w:r>
         <w:rPr>
-          <w:rFonts w:ascii="Verdana" w:eastAsia="Consolas" w:hAnsi="Verdana" w:cs="Consolas"/>
-          <w:b w:val="0"/>
-          <w:bCs w:val="0"/>
-          <w:i/>
-          <w:w w:val="85"/>
-        </w:rPr>
-        <w:lastRenderedPageBreak/>
-        <w:drawing>
-          <wp:inline distT="0" distB="0" distL="0" distR="0" wp14:anchorId="5CCDC471" wp14:editId="29149EFC">
-            <wp:extent cx="5943600" cy="6478270"/>
-            <wp:effectExtent l="0" t="0" r="0" b="0"/>
-            <wp:docPr id="529808972" name="Picture 1"/>
-            <wp:cNvGraphicFramePr>
-              <a:graphicFrameLocks xmlns:a="http://schemas.openxmlformats.org/drawingml/2006/main" noChangeAspect="1"/>
-            </wp:cNvGraphicFramePr>
-            <a:graphic xmlns:a="http://schemas.openxmlformats.org/drawingml/2006/main">
-              <a:graphicData uri="http://schemas.openxmlformats.org/drawingml/2006/picture">
-                <pic:pic xmlns:pic="http://schemas.openxmlformats.org/drawingml/2006/picture">
-                  <pic:nvPicPr>
-                    <pic:cNvPr id="529808972" name=""/>
-                    <pic:cNvPicPr/>
-                  </pic:nvPicPr>
-                  <pic:blipFill>
-                    <a:blip r:embed="rId8"/>
-                    <a:stretch>
-                      <a:fillRect/>
-                    </a:stretch>
-                  </pic:blipFill>
-                  <pic:spPr>
-                    <a:xfrm>
-                      <a:off x="0" y="0"/>
-                      <a:ext cx="5943600" cy="6478270"/>
-                    </a:xfrm>
-                    <a:prstGeom prst="rect">
-                      <a:avLst/>
-                    </a:prstGeom>
-                  </pic:spPr>
-                </pic:pic>
-              </a:graphicData>
-            </a:graphic>
-          </wp:inline>
-        </w:drawing>
-      </w:r>
-    </w:p>
-    <w:p>
-      <w:pPr>
-        <w:pStyle w:val="Heading1"/>
-        <w:tabs>
-          <w:tab w:val="left" w:pos="375"/>
-        </w:tabs>
-        <w:ind w:left="143" w:firstLine="0"/>
-        <w:rPr>
+          <w:noProof/>
           <w:lang w:val="vi-VN"/>
         </w:rPr>
-      </w:pPr>
-      <w:r>
-        <w:rPr>
-          <w:lang w:val="vi-VN"/>
-        </w:rPr>
-        <w:lastRenderedPageBreak/>
-        <w:drawing>
-          <wp:inline distT="0" distB="0" distL="0" distR="0" wp14:anchorId="4D4036CD" wp14:editId="4D658B0D">
-            <wp:extent cx="5943600" cy="3075940"/>
-            <wp:effectExtent l="0" t="0" r="0" b="0"/>
-            <wp:docPr id="398826541" name="Picture 1"/>
-            <wp:cNvGraphicFramePr>
-              <a:graphicFrameLocks xmlns:a="http://schemas.openxmlformats.org/drawingml/2006/main" noChangeAspect="1"/>
-            </wp:cNvGraphicFramePr>
-            <a:graphic xmlns:a="http://schemas.openxmlformats.org/drawingml/2006/main">
-              <a:graphicData uri="http://schemas.openxmlformats.org/drawingml/2006/picture">
-                <pic:pic xmlns:pic="http://schemas.openxmlformats.org/drawingml/2006/picture">
-                  <pic:nvPicPr>
-                    <pic:cNvPr id="398826541" name=""/>
-                    <pic:cNvPicPr/>
-                  </pic:nvPicPr>
-                  <pic:blipFill>
-                    <a:blip r:embed="rId9"/>
-                    <a:stretch>
-                      <a:fillRect/>
-                    </a:stretch>
-                  </pic:blipFill>
-                  <pic:spPr>
-                    <a:xfrm>
-                      <a:off x="0" y="0"/>
-                      <a:ext cx="5943600" cy="3075940"/>
-                    </a:xfrm>
-                    <a:prstGeom prst="rect">
-                      <a:avLst/>
-                    </a:prstGeom>
-                  </pic:spPr>
-                </pic:pic>
-              </a:graphicData>
-            </a:graphic>
-          </wp:inline>
-        </w:drawing>
-      </w:r>
-    </w:p>
-    <w:p>
-      <w:pPr>
-        <w:pStyle w:val="Heading1"/>
-        <w:tabs>
-          <w:tab w:val="left" w:pos="375"/>
-        </w:tabs>
-        <w:ind w:left="143" w:firstLine="0"/>
-        <w:rPr>
-          <w:lang w:val="vi-VN"/>
-        </w:rPr>
-      </w:pPr>
-      <w:r>
-        <w:rPr>
-          <w:lang w:val="vi-VN"/>
-        </w:rPr>
-        <w:lastRenderedPageBreak/>
-        <w:drawing>
-          <wp:inline distT="0" distB="0" distL="0" distR="0" wp14:anchorId="6F5E26F0" wp14:editId="59E7DB6B">
-            <wp:extent cx="5943600" cy="6475095"/>
-            <wp:effectExtent l="0" t="0" r="0" b="1905"/>
-            <wp:docPr id="937424761" name="Picture 1"/>
-            <wp:cNvGraphicFramePr>
-              <a:graphicFrameLocks xmlns:a="http://schemas.openxmlformats.org/drawingml/2006/main" noChangeAspect="1"/>
-            </wp:cNvGraphicFramePr>
-            <a:graphic xmlns:a="http://schemas.openxmlformats.org/drawingml/2006/main">
-              <a:graphicData uri="http://schemas.openxmlformats.org/drawingml/2006/picture">
-                <pic:pic xmlns:pic="http://schemas.openxmlformats.org/drawingml/2006/picture">
-                  <pic:nvPicPr>
-                    <pic:cNvPr id="937424761" name=""/>
-                    <pic:cNvPicPr/>
-                  </pic:nvPicPr>
-                  <pic:blipFill>
-                    <a:blip r:embed="rId10"/>
-                    <a:stretch>
-                      <a:fillRect/>
-                    </a:stretch>
-                  </pic:blipFill>
-                  <pic:spPr>
-                    <a:xfrm>
-                      <a:off x="0" y="0"/>
-                      <a:ext cx="5943600" cy="6475095"/>
-                    </a:xfrm>
-                    <a:prstGeom prst="rect">
-                      <a:avLst/>
-                    </a:prstGeom>
-                  </pic:spPr>
-                </pic:pic>
-              </a:graphicData>
-            </a:graphic>
-          </wp:inline>
-        </w:drawing>
-      </w:r>
-    </w:p>
-    <w:p>
-      <w:pPr>
-        <w:pStyle w:val="Heading1"/>
-        <w:tabs>
-          <w:tab w:val="left" w:pos="375"/>
-        </w:tabs>
-        <w:ind w:left="143" w:firstLine="0"/>
-        <w:rPr>
-          <w:lang w:val="vi-VN"/>
-        </w:rPr>
-      </w:pPr>
-      <w:r>
-        <w:rPr>
-          <w:lang w:val="vi-VN"/>
-        </w:rPr>
-        <w:lastRenderedPageBreak/>
         <w:drawing>
           <wp:inline distT="0" distB="0" distL="0" distR="0" wp14:anchorId="581DD52A" wp14:editId="0000956B">
             <wp:extent cx="5943600" cy="3343275"/>
@@ -19950,7 +21361,7 @@
                     <pic:cNvPicPr/>
                   </pic:nvPicPr>
                   <pic:blipFill>
-                    <a:blip r:embed="rId11"/>
+                    <a:blip r:embed="rId8"/>
                     <a:stretch>
                       <a:fillRect/>
                     </a:stretch>
@@ -21587,6 +22998,7 @@
           <w:b/>
           <w:w w:val="90"/>
         </w:rPr>
+        <w:lastRenderedPageBreak/>
         <w:t>Bài</w:t>
       </w:r>
       <w:r>

</xml_diff>